<commit_message>
Synchronize final project artifacts
</commit_message>
<xml_diff>
--- a/documents/GridCast_Europe_Handout.docx
+++ b/documents/GridCast_Europe_Handout.docx
@@ -1452,7 +1452,7 @@
           <w:color w:val="2F5EAC"/>
           <w:sz w:val="17"/>
         </w:rPr>
-        <w:t xml:space="preserve">• </w:t>
+        <w:t>• Zyklische Kodierung: Sinus/Cosinus für Stunde, Wochentag und Jahresverlauf; der Monat bleibt ein separates Merkmal.</w:t>
       </w:r>
       <w:r>
         <w:rPr>
@@ -1462,7 +1462,6 @@
           <w:color w:val="111111"/>
           <w:sz w:val="17"/>
         </w:rPr>
-        <w:t>Zyklische Kodierung: Sinus/Cosinus für Stunde, Wochentag und Monat.</w:t>
       </w:r>
     </w:p>
     <w:p>
@@ -1646,7 +1645,7 @@
           <w:color w:val="111111"/>
           <w:sz w:val="18"/>
         </w:rPr>
-        <w:t>A³ untersuchte nicht nur Modellklassen, sondern auch Featuregruppen und Hyperparameter. Das Testjahr 2019 wurde weder geladen noch zur Auswahl verwendet.</w:t>
+        <w:t>A³ untersuchte nicht nur Modellklassen, sondern auch Featuregruppen und Hyperparameter. Der gemeinsame Datensatz wurde eingelesen; 2019 wurde unmittelbar ausgeschlossen und weder ausgewertet noch zur Auswahl oder zum Tuning verwendet.</w:t>
       </w:r>
     </w:p>
     <w:tbl>
@@ -3937,7 +3936,7 @@
                 <w:color w:val="111111"/>
                 <w:sz w:val="16"/>
               </w:rPr>
-              <w:t>Temperatur, Nachfrage und Rechenzentrumslast variieren</w:t>
+              <w:t>Wetter, Nachfrage, Rechenzentren und Zukunftspfad variieren</w:t>
             </w:r>
           </w:p>
         </w:tc>
@@ -4054,7 +4053,7 @@
           <w:color w:val="111111"/>
           <w:sz w:val="18"/>
         </w:rPr>
-        <w:t>Für ein gewähltes Datum erzeugt die App ein typisches 24-Stunden-Wetterprofil nach Land, Monat und lokaler Stunde. Eine Temperaturabweichung wirkt vor der ML-Inferenz; Nachfrageänderung und zusätzliche Rechenzentrumslast werden danach als sichtbare Annahmen angewendet.</w:t>
+        <w:t>Für ein gewähltes Datum erzeugt die App ein typisches 24-Stunden-Wetterprofil. Temperatur sowie direkte und diffuse Strahlung wirken vor der ML-Inferenz; Nachfrage und Rechenzentren danach. Sieben Presets und ein gekoppelter 2020-2050-Pfad setzen transparente, weiterhin editierbare Startwerte.</w:t>
       </w:r>
     </w:p>
     <w:tbl>
@@ -4091,7 +4090,7 @@
                 <w:color w:val="17365D"/>
                 <w:sz w:val="18"/>
               </w:rPr>
-              <w:t xml:space="preserve">Beispielszenario: </w:t>
+              <w:t>Beispielszenario: Deutschland, 15.01.2030, +2 °C, direkte Strahlung 160 %, diffuse Strahlung 70 %, +10 % Nachfrage und +500 MW Rechenzentrumslast: modellierte Spitzenlast 82.693 MW statt 75.014 MW (+10,24 %). Dies ist eine konditionale Szenariorechnung, keine konkrete Jahresprognose.</w:t>
             </w:r>
             <w:r>
               <w:rPr>
@@ -4101,7 +4100,6 @@
                 <w:color w:val="111111"/>
                 <w:sz w:val="18"/>
               </w:rPr>
-              <w:t>Deutschland, 15.01.2030, +2 °C, +10 % Nachfrage und +500 MW Rechenzentrumslast: modellierte Spitzenlast 82.693 MW statt 75.014 MW (+10,24 %). Dies ist eine konditionale Szenariorechnung, keine konkrete Jahresprognose.</w:t>
             </w:r>
           </w:p>
         </w:tc>
@@ -4124,7 +4122,7 @@
           <w:color w:val="111111"/>
           <w:sz w:val="18"/>
         </w:rPr>
-        <w:t>Der Extremzustandsindikator simuliert, wie häufig ein Szenariotag unter historischen Residualpfaden eine nationale Q95-/Q99-Lastschwelle überschreitet. Er bezeichnet keine Blackout-, Netzüberlastungs- oder Versorgungsausfallwahrscheinlichkeit.</w:t>
+        <w:t>Der Extremzustandsindikator simuliert, wie häufig ein Szenariotag unter historischen Residualpfaden eine nationale Q95-/Q99-Lastschwelle überschreitet. Beide Varianten wurden nachgelagert auf 2019 evaluiert. Die Kennzahl bezeichnet keine Blackout-, Netzüberlastungs- oder Versorgungsausfallwahrscheinlichkeit.</w:t>
       </w:r>
     </w:p>
     <w:p>
@@ -4174,7 +4172,7 @@
           <w:color w:val="2F5EAC"/>
           <w:sz w:val="17"/>
         </w:rPr>
-        <w:t xml:space="preserve">• </w:t>
+        <w:t>• 34 von 34 Modell-, Szenario-, Risiko- und App-Strukturtests bestanden.</w:t>
       </w:r>
       <w:r>
         <w:rPr>
@@ -4184,7 +4182,6 @@
           <w:color w:val="111111"/>
           <w:sz w:val="17"/>
         </w:rPr>
-        <w:t>Elf Modell-, Szenario-, Risiko- und App-Strukturtests bestanden.</w:t>
       </w:r>
     </w:p>
     <w:p>
@@ -4259,7 +4256,7 @@
           <w:color w:val="111111"/>
           <w:sz w:val="18"/>
         </w:rPr>
-        <w:t>Open Power System Data (OPSD), Time Series und Weather Data Packages (Datenstand 2020); Quibeldey-Cirkel, QUA3CK-Unterlagen und E-Mail-Aufgabenstellung (2026); Pedregosa et al., Scikit-learn: Machine Learning in Python (JMLR, 2011); Streamlit Documentation, Community Cloud Deployment (Abruf 25.07.2026).</w:t>
+        <w:t>Open Power System Data (OPSD), Time Series und Weather Data Packages (2020); Quibeldey-Cirkel, QUA3CK-Unterlagen (2026); Pedregosa et al. (JMLR, 2011); EEA, Global and European temperatures; ENTSO-E/ENTSOG, TYNDP 2024; IEA, Energy and AI; Segado-Moreno et al. (2026); Streamlit Documentation (Abruf 25.07.2026).</w:t>
       </w:r>
     </w:p>
     <w:p>

</xml_diff>